<commit_message>
Calculator App wix template
</commit_message>
<xml_diff>
--- a/Deployment_Portfolio1.docx
+++ b/Deployment_Portfolio1.docx
@@ -51,7 +51,16 @@
         <w:jc w:val="center"/>
       </w:pPr>
       <w:r>
-        <w:t>Declared Target Level: 1.3</w:t>
+        <w:t xml:space="preserve">Declared Target Level: </w:t>
+      </w:r>
+      <w:r>
+        <w:t>Distinction (</w:t>
+      </w:r>
+      <w:r>
+        <w:t>1.3</w:t>
+      </w:r>
+      <w:r>
+        <w:t>)</w:t>
       </w:r>
     </w:p>
     <w:p>
@@ -188,7 +197,7 @@
         <w:pStyle w:val="Heading2"/>
       </w:pPr>
       <w:r>
-        <w:t>Deployment Task 1</w:t>
+        <w:t>Pass Level Task</w:t>
       </w:r>
       <w:r>
         <w:t>:</w:t>
@@ -308,6 +317,42 @@
       <w:r>
         <w:t xml:space="preserve"> I also configured the git repository for code versioning as well as for assignment submissions.</w:t>
       </w:r>
+      <w:r>
+        <w:t xml:space="preserve"> Lastly, I added the </w:t>
+      </w:r>
+      <w:proofErr w:type="spellStart"/>
+      <w:r>
+        <w:t>SampleApp</w:t>
+      </w:r>
+      <w:proofErr w:type="spellEnd"/>
+      <w:r>
+        <w:t xml:space="preserve"> as a reference to the </w:t>
+      </w:r>
+      <w:proofErr w:type="spellStart"/>
+      <w:r>
+        <w:t>SampleAppSetup</w:t>
+      </w:r>
+      <w:proofErr w:type="spellEnd"/>
+      <w:r>
+        <w:t xml:space="preserve"> so that whenever I build the application it would know where the exe file is for the </w:t>
+      </w:r>
+      <w:proofErr w:type="spellStart"/>
+      <w:r>
+        <w:t>SampleApp</w:t>
+      </w:r>
+      <w:proofErr w:type="spellEnd"/>
+      <w:r>
+        <w:t xml:space="preserve">. </w:t>
+      </w:r>
+    </w:p>
+    <w:p>
+      <w:pPr>
+        <w:pStyle w:val="Heading3"/>
+      </w:pPr>
+      <w:r>
+        <w:lastRenderedPageBreak/>
+        <w:t>Running Application</w:t>
+      </w:r>
     </w:p>
     <w:p>
       <w:r>
@@ -359,7 +404,6 @@
         </w:rPr>
       </w:pPr>
       <w:r>
-        <w:lastRenderedPageBreak/>
         <w:tab/>
       </w:r>
       <w:r>
@@ -376,7 +420,21 @@
           <w:i/>
           <w:iCs/>
         </w:rPr>
-        <w:t>Figure 1, Deployed program</w:t>
+        <w:t xml:space="preserve">Figure </w:t>
+      </w:r>
+      <w:r>
+        <w:rPr>
+          <w:i/>
+          <w:iCs/>
+        </w:rPr>
+        <w:t>2</w:t>
+      </w:r>
+      <w:r>
+        <w:rPr>
+          <w:i/>
+          <w:iCs/>
+        </w:rPr>
+        <w:t>, Deployed program</w:t>
       </w:r>
     </w:p>
     <w:p>
@@ -416,12 +474,10 @@
         <w:t xml:space="preserve">, </w:t>
       </w:r>
       <w:proofErr w:type="spellStart"/>
-      <w:proofErr w:type="gramStart"/>
       <w:r>
         <w:t>config.json</w:t>
       </w:r>
       <w:proofErr w:type="spellEnd"/>
-      <w:proofErr w:type="gramEnd"/>
       <w:r>
         <w:t xml:space="preserve"> and </w:t>
       </w:r>
@@ -436,11 +492,11 @@
     </w:p>
     <w:p>
       <w:pPr>
-        <w:rPr>
-          <w:i/>
-          <w:iCs/>
-        </w:rPr>
-      </w:pPr>
+        <w:pStyle w:val="Heading3"/>
+      </w:pPr>
+      <w:r>
+        <w:t xml:space="preserve">Deleting Application </w:t>
+      </w:r>
     </w:p>
     <w:p>
       <w:pPr>
@@ -526,7 +582,21 @@
           <w:iCs/>
         </w:rPr>
         <w:tab/>
-        <w:t xml:space="preserve">Figure 2, </w:t>
+        <w:t xml:space="preserve">Figure </w:t>
+      </w:r>
+      <w:r>
+        <w:rPr>
+          <w:i/>
+          <w:iCs/>
+        </w:rPr>
+        <w:t>3</w:t>
+      </w:r>
+      <w:r>
+        <w:rPr>
+          <w:i/>
+          <w:iCs/>
+        </w:rPr>
+        <w:t xml:space="preserve">, </w:t>
       </w:r>
       <w:proofErr w:type="spellStart"/>
       <w:r>
@@ -555,9 +625,305 @@
       </w:r>
       <w:proofErr w:type="spellEnd"/>
       <w:r>
-        <w:t xml:space="preserve"> installer when debugging how to run the program without it instantly closing. Then I took a snippet of the application being detected then uninstalled. </w:t>
-      </w:r>
-    </w:p>
+        <w:t xml:space="preserve"> installer when debugging how to run the </w:t>
+      </w:r>
+      <w:r>
+        <w:lastRenderedPageBreak/>
+        <w:t xml:space="preserve">program without it instantly closing. Then I took a snippet of the application being detected then uninstalled. </w:t>
+      </w:r>
+    </w:p>
+    <w:p>
+      <w:pPr>
+        <w:pStyle w:val="Heading2"/>
+      </w:pPr>
+      <w:r>
+        <w:t>Credit Level Task:</w:t>
+      </w:r>
+    </w:p>
+    <w:p>
+      <w:pPr>
+        <w:pStyle w:val="Heading3"/>
+      </w:pPr>
+      <w:r>
+        <w:t>Creating Calculator Application</w:t>
+      </w:r>
+    </w:p>
+    <w:p>
+      <w:r>
+        <w:drawing>
+          <wp:inline distT="0" distB="0" distL="0" distR="0" wp14:anchorId="2CF3E8B2" wp14:editId="02BB93F0">
+            <wp:extent cx="5731510" cy="3016250"/>
+            <wp:effectExtent l="0" t="0" r="2540" b="0"/>
+            <wp:docPr id="376490952" name="Picture 1"/>
+            <wp:cNvGraphicFramePr>
+              <a:graphicFrameLocks xmlns:a="http://schemas.openxmlformats.org/drawingml/2006/main" noChangeAspect="1"/>
+            </wp:cNvGraphicFramePr>
+            <a:graphic xmlns:a="http://schemas.openxmlformats.org/drawingml/2006/main">
+              <a:graphicData uri="http://schemas.openxmlformats.org/drawingml/2006/picture">
+                <pic:pic xmlns:pic="http://schemas.openxmlformats.org/drawingml/2006/picture">
+                  <pic:nvPicPr>
+                    <pic:cNvPr id="376490952" name=""/>
+                    <pic:cNvPicPr/>
+                  </pic:nvPicPr>
+                  <pic:blipFill>
+                    <a:blip r:embed="rId8"/>
+                    <a:stretch>
+                      <a:fillRect/>
+                    </a:stretch>
+                  </pic:blipFill>
+                  <pic:spPr>
+                    <a:xfrm>
+                      <a:off x="0" y="0"/>
+                      <a:ext cx="5731510" cy="3016250"/>
+                    </a:xfrm>
+                    <a:prstGeom prst="rect">
+                      <a:avLst/>
+                    </a:prstGeom>
+                  </pic:spPr>
+                </pic:pic>
+              </a:graphicData>
+            </a:graphic>
+          </wp:inline>
+        </w:drawing>
+      </w:r>
+    </w:p>
+    <w:p>
+      <w:pPr>
+        <w:rPr>
+          <w:i/>
+          <w:iCs/>
+        </w:rPr>
+      </w:pPr>
+      <w:r>
+        <w:tab/>
+      </w:r>
+      <w:r>
+        <w:tab/>
+      </w:r>
+      <w:r>
+        <w:tab/>
+      </w:r>
+      <w:r>
+        <w:tab/>
+      </w:r>
+      <w:r>
+        <w:rPr>
+          <w:i/>
+          <w:iCs/>
+        </w:rPr>
+        <w:t xml:space="preserve">Figure 4, Calculator Application </w:t>
+      </w:r>
+    </w:p>
+    <w:p>
+      <w:r>
+        <w:t xml:space="preserve">For credit task I decided to create a terminal calculator application which works by running a constant while loop that asks the user for 2 numbers and a mathematical operator, then producing a result. Achieved through utilising the switch cases where the computer system would know how to manipulate the number stored in the memory based on the operation input. To exit the program the user would be required to close the terminal, since other calculator apps do not ask if users want to continue simply awaiting </w:t>
+      </w:r>
+      <w:r>
+        <w:t xml:space="preserve">response, so I have put the entire working code inside a while loop that remains true throughout the session. </w:t>
+      </w:r>
+    </w:p>
+    <w:p>
+      <w:pPr>
+        <w:pStyle w:val="Heading3"/>
+      </w:pPr>
+      <w:r>
+        <w:lastRenderedPageBreak/>
+        <w:t>Building Application</w:t>
+      </w:r>
+    </w:p>
+    <w:p>
+      <w:r>
+        <w:drawing>
+          <wp:inline distT="0" distB="0" distL="0" distR="0" wp14:anchorId="276582B5" wp14:editId="552EAA80">
+            <wp:extent cx="6126214" cy="3291840"/>
+            <wp:effectExtent l="0" t="0" r="8255" b="3810"/>
+            <wp:docPr id="1521781316" name="Picture 1"/>
+            <wp:cNvGraphicFramePr>
+              <a:graphicFrameLocks xmlns:a="http://schemas.openxmlformats.org/drawingml/2006/main" noChangeAspect="1"/>
+            </wp:cNvGraphicFramePr>
+            <a:graphic xmlns:a="http://schemas.openxmlformats.org/drawingml/2006/main">
+              <a:graphicData uri="http://schemas.openxmlformats.org/drawingml/2006/picture">
+                <pic:pic xmlns:pic="http://schemas.openxmlformats.org/drawingml/2006/picture">
+                  <pic:nvPicPr>
+                    <pic:cNvPr id="1521781316" name=""/>
+                    <pic:cNvPicPr/>
+                  </pic:nvPicPr>
+                  <pic:blipFill>
+                    <a:blip r:embed="rId9"/>
+                    <a:stretch>
+                      <a:fillRect/>
+                    </a:stretch>
+                  </pic:blipFill>
+                  <pic:spPr>
+                    <a:xfrm>
+                      <a:off x="0" y="0"/>
+                      <a:ext cx="6133816" cy="3295925"/>
+                    </a:xfrm>
+                    <a:prstGeom prst="rect">
+                      <a:avLst/>
+                    </a:prstGeom>
+                  </pic:spPr>
+                </pic:pic>
+              </a:graphicData>
+            </a:graphic>
+          </wp:inline>
+        </w:drawing>
+      </w:r>
+    </w:p>
+    <w:p>
+      <w:pPr>
+        <w:rPr>
+          <w:i/>
+          <w:iCs/>
+        </w:rPr>
+      </w:pPr>
+      <w:r>
+        <w:tab/>
+      </w:r>
+      <w:r>
+        <w:tab/>
+      </w:r>
+      <w:r>
+        <w:tab/>
+      </w:r>
+      <w:r>
+        <w:tab/>
+      </w:r>
+      <w:r>
+        <w:rPr>
+          <w:i/>
+          <w:iCs/>
+        </w:rPr>
+        <w:t>Figure 5, Build Calculator Setup</w:t>
+      </w:r>
+    </w:p>
+    <w:p>
+      <w:r>
+        <w:t xml:space="preserve">After development of the application, I selected the build project option to create the CalculatorApp.exe and other dependencies required to use for WIX. After this I used the WIX extension to create the </w:t>
+      </w:r>
+      <w:proofErr w:type="spellStart"/>
+      <w:r>
+        <w:t>CalculatorAppSetup</w:t>
+      </w:r>
+      <w:proofErr w:type="spellEnd"/>
+      <w:r>
+        <w:t xml:space="preserve"> project which includes the .</w:t>
+      </w:r>
+      <w:proofErr w:type="spellStart"/>
+      <w:r>
+        <w:t>wx</w:t>
+      </w:r>
+      <w:proofErr w:type="spellEnd"/>
+      <w:r>
+        <w:t xml:space="preserve"> file where it determines what to download after running the </w:t>
+      </w:r>
+      <w:proofErr w:type="spellStart"/>
+      <w:r>
+        <w:t>CalculatorApp</w:t>
+      </w:r>
+      <w:proofErr w:type="spellEnd"/>
+      <w:r>
+        <w:t xml:space="preserve"> setup. In figure 5 The .</w:t>
+      </w:r>
+      <w:proofErr w:type="spellStart"/>
+      <w:r>
+        <w:t>wx</w:t>
+      </w:r>
+      <w:proofErr w:type="spellEnd"/>
+      <w:r>
+        <w:t xml:space="preserve"> I have copied the structure provided in the task 1 tutorial of the assignment where it defined the location of instalment in the Program files folder, furthermore I included extra lines of code defining the </w:t>
+      </w:r>
+      <w:proofErr w:type="spellStart"/>
+      <w:r>
+        <w:t>dll</w:t>
+      </w:r>
+      <w:proofErr w:type="spellEnd"/>
+      <w:r>
+        <w:t xml:space="preserve">, runtime, exe and deps files which are required to run the program as they include the code but framework the program runs on. </w:t>
+      </w:r>
+    </w:p>
+    <w:p>
+      <w:r>
+        <w:drawing>
+          <wp:inline distT="0" distB="0" distL="0" distR="0" wp14:anchorId="4D57FA3B" wp14:editId="2FD38869">
+            <wp:extent cx="5645752" cy="3009900"/>
+            <wp:effectExtent l="0" t="0" r="0" b="0"/>
+            <wp:docPr id="1510577592" name="Picture 1"/>
+            <wp:cNvGraphicFramePr>
+              <a:graphicFrameLocks xmlns:a="http://schemas.openxmlformats.org/drawingml/2006/main" noChangeAspect="1"/>
+            </wp:cNvGraphicFramePr>
+            <a:graphic xmlns:a="http://schemas.openxmlformats.org/drawingml/2006/main">
+              <a:graphicData uri="http://schemas.openxmlformats.org/drawingml/2006/picture">
+                <pic:pic xmlns:pic="http://schemas.openxmlformats.org/drawingml/2006/picture">
+                  <pic:nvPicPr>
+                    <pic:cNvPr id="1510577592" name=""/>
+                    <pic:cNvPicPr/>
+                  </pic:nvPicPr>
+                  <pic:blipFill>
+                    <a:blip r:embed="rId10"/>
+                    <a:stretch>
+                      <a:fillRect/>
+                    </a:stretch>
+                  </pic:blipFill>
+                  <pic:spPr>
+                    <a:xfrm>
+                      <a:off x="0" y="0"/>
+                      <a:ext cx="5648498" cy="3011364"/>
+                    </a:xfrm>
+                    <a:prstGeom prst="rect">
+                      <a:avLst/>
+                    </a:prstGeom>
+                  </pic:spPr>
+                </pic:pic>
+              </a:graphicData>
+            </a:graphic>
+          </wp:inline>
+        </w:drawing>
+      </w:r>
+    </w:p>
+    <w:p>
+      <w:pPr>
+        <w:rPr>
+          <w:i/>
+          <w:iCs/>
+        </w:rPr>
+      </w:pPr>
+      <w:r>
+        <w:tab/>
+      </w:r>
+      <w:r>
+        <w:tab/>
+      </w:r>
+      <w:r>
+        <w:tab/>
+      </w:r>
+      <w:r>
+        <w:tab/>
+      </w:r>
+      <w:r>
+        <w:rPr>
+          <w:i/>
+          <w:iCs/>
+        </w:rPr>
+        <w:t>Figure 6, creating MSI file</w:t>
+      </w:r>
+    </w:p>
+    <w:p>
+      <w:r>
+        <w:lastRenderedPageBreak/>
+        <w:t>Lastly, in figure 6 the image shows the output after creating a reference of the Calculator App then selecting the build option on the WIX project. This tool allows for the transformation of the .</w:t>
+      </w:r>
+      <w:proofErr w:type="spellStart"/>
+      <w:r>
+        <w:t>wx</w:t>
+      </w:r>
+      <w:proofErr w:type="spellEnd"/>
+      <w:r>
+        <w:t xml:space="preserve"> file into the MSI package which acts as a container for the Calculator application dependencies. </w:t>
+      </w:r>
+    </w:p>
+    <w:p/>
+    <w:p/>
     <w:p>
       <w:pPr>
         <w:pStyle w:val="Heading1"/>
@@ -576,7 +942,7 @@
       <w:r>
         <w:t xml:space="preserve"> repository: </w:t>
       </w:r>
-      <w:hyperlink r:id="rId8" w:history="1">
+      <w:hyperlink r:id="rId11" w:history="1">
         <w:r>
           <w:rPr>
             <w:rStyle w:val="Hyperlink"/>

</xml_diff>

<commit_message>
Mean and json format
</commit_message>
<xml_diff>
--- a/Deployment_Portfolio1.docx
+++ b/Deployment_Portfolio1.docx
@@ -993,7 +993,227 @@
         <w:t xml:space="preserve">Figure 7 highlights the working application of the calculator app that appears within the program folder, the current program has some issues with user input and the way it handles exceptions but nonetheless the program is has been packaged accordingly with no errors. </w:t>
       </w:r>
     </w:p>
+    <w:p>
+      <w:pPr>
+        <w:pStyle w:val="Heading2"/>
+      </w:pPr>
+      <w:r>
+        <w:t>Distinction</w:t>
+      </w:r>
+      <w:r>
+        <w:t xml:space="preserve"> Level Task:</w:t>
+      </w:r>
+    </w:p>
+    <w:p>
+      <w:pPr>
+        <w:pStyle w:val="Heading3"/>
+      </w:pPr>
+      <w:r>
+        <w:t xml:space="preserve">Downloading new library </w:t>
+      </w:r>
+    </w:p>
+    <w:p>
+      <w:r>
+        <w:drawing>
+          <wp:inline distT="0" distB="0" distL="0" distR="0" wp14:anchorId="2DD004CF" wp14:editId="40689DFE">
+            <wp:extent cx="5731510" cy="3023870"/>
+            <wp:effectExtent l="0" t="0" r="2540" b="5080"/>
+            <wp:docPr id="18942753" name="Picture 1"/>
+            <wp:cNvGraphicFramePr>
+              <a:graphicFrameLocks xmlns:a="http://schemas.openxmlformats.org/drawingml/2006/main" noChangeAspect="1"/>
+            </wp:cNvGraphicFramePr>
+            <a:graphic xmlns:a="http://schemas.openxmlformats.org/drawingml/2006/main">
+              <a:graphicData uri="http://schemas.openxmlformats.org/drawingml/2006/picture">
+                <pic:pic xmlns:pic="http://schemas.openxmlformats.org/drawingml/2006/picture">
+                  <pic:nvPicPr>
+                    <pic:cNvPr id="18942753" name=""/>
+                    <pic:cNvPicPr/>
+                  </pic:nvPicPr>
+                  <pic:blipFill>
+                    <a:blip r:embed="rId12"/>
+                    <a:stretch>
+                      <a:fillRect/>
+                    </a:stretch>
+                  </pic:blipFill>
+                  <pic:spPr>
+                    <a:xfrm>
+                      <a:off x="0" y="0"/>
+                      <a:ext cx="5731510" cy="3023870"/>
+                    </a:xfrm>
+                    <a:prstGeom prst="rect">
+                      <a:avLst/>
+                    </a:prstGeom>
+                  </pic:spPr>
+                </pic:pic>
+              </a:graphicData>
+            </a:graphic>
+          </wp:inline>
+        </w:drawing>
+      </w:r>
+    </w:p>
+    <w:p>
+      <w:pPr>
+        <w:rPr>
+          <w:i/>
+          <w:iCs/>
+        </w:rPr>
+      </w:pPr>
+      <w:r>
+        <w:lastRenderedPageBreak/>
+        <w:tab/>
+      </w:r>
+      <w:r>
+        <w:tab/>
+      </w:r>
+      <w:r>
+        <w:tab/>
+      </w:r>
+      <w:r>
+        <w:tab/>
+      </w:r>
+      <w:r>
+        <w:rPr>
+          <w:i/>
+          <w:iCs/>
+        </w:rPr>
+        <w:t xml:space="preserve">Figure 8, New Libraries </w:t>
+      </w:r>
+    </w:p>
+    <w:p>
+      <w:r>
+        <w:t xml:space="preserve">For the distinction task, it was required to implement multiple external DLLs so I have chosen the </w:t>
+      </w:r>
+      <w:proofErr w:type="spellStart"/>
+      <w:r>
+        <w:t>Mathnet</w:t>
+      </w:r>
+      <w:proofErr w:type="spellEnd"/>
+      <w:r>
+        <w:t xml:space="preserve"> and </w:t>
+      </w:r>
+      <w:proofErr w:type="spellStart"/>
+      <w:r>
+        <w:t>Newtonsoft</w:t>
+      </w:r>
+      <w:proofErr w:type="spellEnd"/>
+      <w:r>
+        <w:t xml:space="preserve"> library which helps in implementing complex mathematical operators as well as being able to store calculator history in </w:t>
+      </w:r>
+      <w:proofErr w:type="spellStart"/>
+      <w:r>
+        <w:t>json</w:t>
+      </w:r>
+      <w:proofErr w:type="spellEnd"/>
+      <w:r>
+        <w:t xml:space="preserve"> format. </w:t>
+      </w:r>
+    </w:p>
+    <w:p>
+      <w:pPr>
+        <w:pStyle w:val="Heading3"/>
+      </w:pPr>
+      <w:r>
+        <w:t>Calculating Mean</w:t>
+      </w:r>
+    </w:p>
+    <w:p>
+      <w:r>
+        <w:drawing>
+          <wp:inline distT="0" distB="0" distL="0" distR="0" wp14:anchorId="690BBCD5" wp14:editId="0157977D">
+            <wp:extent cx="5731510" cy="2934335"/>
+            <wp:effectExtent l="0" t="0" r="2540" b="0"/>
+            <wp:docPr id="1695317596" name="Picture 1"/>
+            <wp:cNvGraphicFramePr>
+              <a:graphicFrameLocks xmlns:a="http://schemas.openxmlformats.org/drawingml/2006/main" noChangeAspect="1"/>
+            </wp:cNvGraphicFramePr>
+            <a:graphic xmlns:a="http://schemas.openxmlformats.org/drawingml/2006/main">
+              <a:graphicData uri="http://schemas.openxmlformats.org/drawingml/2006/picture">
+                <pic:pic xmlns:pic="http://schemas.openxmlformats.org/drawingml/2006/picture">
+                  <pic:nvPicPr>
+                    <pic:cNvPr id="1695317596" name=""/>
+                    <pic:cNvPicPr/>
+                  </pic:nvPicPr>
+                  <pic:blipFill>
+                    <a:blip r:embed="rId13"/>
+                    <a:stretch>
+                      <a:fillRect/>
+                    </a:stretch>
+                  </pic:blipFill>
+                  <pic:spPr>
+                    <a:xfrm>
+                      <a:off x="0" y="0"/>
+                      <a:ext cx="5731510" cy="2934335"/>
+                    </a:xfrm>
+                    <a:prstGeom prst="rect">
+                      <a:avLst/>
+                    </a:prstGeom>
+                  </pic:spPr>
+                </pic:pic>
+              </a:graphicData>
+            </a:graphic>
+          </wp:inline>
+        </w:drawing>
+      </w:r>
+    </w:p>
+    <w:p>
+      <w:pPr>
+        <w:ind w:left="2880"/>
+        <w:rPr>
+          <w:i/>
+          <w:iCs/>
+        </w:rPr>
+      </w:pPr>
+      <w:r>
+        <w:rPr>
+          <w:i/>
+          <w:iCs/>
+        </w:rPr>
+        <w:t xml:space="preserve">       </w:t>
+      </w:r>
+      <w:r>
+        <w:rPr>
+          <w:i/>
+          <w:iCs/>
+        </w:rPr>
+        <w:t xml:space="preserve">Figure </w:t>
+      </w:r>
+      <w:r>
+        <w:rPr>
+          <w:i/>
+          <w:iCs/>
+        </w:rPr>
+        <w:t>9</w:t>
+      </w:r>
+      <w:r>
+        <w:rPr>
+          <w:i/>
+          <w:iCs/>
+        </w:rPr>
+        <w:t xml:space="preserve">, </w:t>
+      </w:r>
+      <w:r>
+        <w:rPr>
+          <w:i/>
+          <w:iCs/>
+        </w:rPr>
+        <w:t xml:space="preserve">Mean Calculation </w:t>
+      </w:r>
+    </w:p>
+    <w:p>
+      <w:r>
+        <w:t xml:space="preserve">I have imported the mean method from the </w:t>
+      </w:r>
+      <w:proofErr w:type="spellStart"/>
+      <w:r>
+        <w:t>mathnet</w:t>
+      </w:r>
+      <w:proofErr w:type="spellEnd"/>
+      <w:r>
+        <w:t xml:space="preserve"> library to calculate the average from a given number, by taking the input of the user then storing the values inside an array after removing white spaces as well as separating each individual values. Then, applied the mean method on the array which iterates through each values and produces the average number in the array. </w:t>
+      </w:r>
+    </w:p>
     <w:p/>
+    <w:p/>
     <w:p>
       <w:pPr>
         <w:pStyle w:val="Heading1"/>
@@ -1012,7 +1232,7 @@
       <w:r>
         <w:t xml:space="preserve"> repository: </w:t>
       </w:r>
-      <w:hyperlink r:id="rId12" w:history="1">
+      <w:hyperlink r:id="rId14" w:history="1">
         <w:r>
           <w:rPr>
             <w:rStyle w:val="Hyperlink"/>

</xml_diff>

<commit_message>
Working applicaiton with mean and json
</commit_message>
<xml_diff>
--- a/Deployment_Portfolio1.docx
+++ b/Deployment_Portfolio1.docx
@@ -272,44 +272,12 @@
           <w:i/>
           <w:iCs/>
         </w:rPr>
-        <w:t xml:space="preserve">Figure 1, </w:t>
-      </w:r>
-      <w:proofErr w:type="spellStart"/>
-      <w:r>
-        <w:rPr>
-          <w:i/>
-          <w:iCs/>
-        </w:rPr>
-        <w:t>SampleApp</w:t>
-      </w:r>
-      <w:proofErr w:type="spellEnd"/>
-      <w:r>
-        <w:rPr>
-          <w:i/>
-          <w:iCs/>
-        </w:rPr>
-        <w:t xml:space="preserve"> Directory</w:t>
-      </w:r>
-    </w:p>
-    <w:p>
-      <w:r>
-        <w:t xml:space="preserve">To Setup the file structure of </w:t>
-      </w:r>
-      <w:proofErr w:type="spellStart"/>
-      <w:r>
-        <w:t>SampleApp</w:t>
-      </w:r>
-      <w:proofErr w:type="spellEnd"/>
-      <w:r>
-        <w:t xml:space="preserve"> I had installed the WIX extension as well as the WIX toolset, which was used to create the </w:t>
-      </w:r>
-      <w:proofErr w:type="spellStart"/>
-      <w:r>
-        <w:t>SampleAppSetup</w:t>
-      </w:r>
-      <w:proofErr w:type="spellEnd"/>
-      <w:r>
-        <w:t xml:space="preserve">, helping to package the application into the MSI format for windows as well as bundle the application code in DLL containers. Additionally, at this step I did not have to install the .Net framework since it was already installed </w:t>
+        <w:t>Figure 1, SampleApp Directory</w:t>
+      </w:r>
+    </w:p>
+    <w:p>
+      <w:r>
+        <w:t xml:space="preserve">To Setup the file structure of SampleApp I had installed the WIX extension as well as the WIX toolset, which was used to create the SampleAppSetup, helping to package the application into the MSI format for windows as well as bundle the application code in DLL containers. Additionally, at this step I did not have to install the .Net framework since it was already installed </w:t>
       </w:r>
       <w:r>
         <w:t>however,</w:t>
@@ -318,31 +286,7 @@
         <w:t xml:space="preserve"> I also configured the git repository for code versioning as well as for assignment submissions.</w:t>
       </w:r>
       <w:r>
-        <w:t xml:space="preserve"> Lastly, I added the </w:t>
-      </w:r>
-      <w:proofErr w:type="spellStart"/>
-      <w:r>
-        <w:t>SampleApp</w:t>
-      </w:r>
-      <w:proofErr w:type="spellEnd"/>
-      <w:r>
-        <w:t xml:space="preserve"> as a reference to the </w:t>
-      </w:r>
-      <w:proofErr w:type="spellStart"/>
-      <w:r>
-        <w:t>SampleAppSetup</w:t>
-      </w:r>
-      <w:proofErr w:type="spellEnd"/>
-      <w:r>
-        <w:t xml:space="preserve"> so that whenever I build the application it would know where the exe file is for the </w:t>
-      </w:r>
-      <w:proofErr w:type="spellStart"/>
-      <w:r>
-        <w:t>SampleApp</w:t>
-      </w:r>
-      <w:proofErr w:type="spellEnd"/>
-      <w:r>
-        <w:t xml:space="preserve">. </w:t>
+        <w:t xml:space="preserve"> Lastly, I added the SampleApp as a reference to the SampleAppSetup so that whenever I build the application it would know where the exe file is for the SampleApp. </w:t>
       </w:r>
     </w:p>
     <w:p>
@@ -439,55 +383,7 @@
     </w:p>
     <w:p>
       <w:r>
-        <w:t xml:space="preserve">Figure 1, Shows the working </w:t>
-      </w:r>
-      <w:proofErr w:type="spellStart"/>
-      <w:r>
-        <w:t>SampleApp</w:t>
-      </w:r>
-      <w:proofErr w:type="spellEnd"/>
-      <w:r>
-        <w:t xml:space="preserve"> application being run inside the program files folder which was specified within the </w:t>
-      </w:r>
-      <w:proofErr w:type="spellStart"/>
-      <w:r>
-        <w:t>Product.wxs</w:t>
-      </w:r>
-      <w:proofErr w:type="spellEnd"/>
-      <w:r>
-        <w:t xml:space="preserve"> file. At this step there were some errors that occurred such as the program not being able to open. To fix this I had to include extra lines of code which specified additional components to include within the </w:t>
-      </w:r>
-      <w:proofErr w:type="spellStart"/>
-      <w:r>
-        <w:t>SampleApp</w:t>
-      </w:r>
-      <w:proofErr w:type="spellEnd"/>
-      <w:r>
-        <w:t xml:space="preserve"> folder such as the </w:t>
-      </w:r>
-      <w:proofErr w:type="spellStart"/>
-      <w:r>
-        <w:t>dll</w:t>
-      </w:r>
-      <w:proofErr w:type="spellEnd"/>
-      <w:r>
-        <w:t xml:space="preserve">, </w:t>
-      </w:r>
-      <w:proofErr w:type="spellStart"/>
-      <w:r>
-        <w:t>config.json</w:t>
-      </w:r>
-      <w:proofErr w:type="spellEnd"/>
-      <w:r>
-        <w:t xml:space="preserve"> and </w:t>
-      </w:r>
-      <w:proofErr w:type="spellStart"/>
-      <w:r>
-        <w:t>dep.json</w:t>
-      </w:r>
-      <w:proofErr w:type="spellEnd"/>
-      <w:r>
-        <w:t xml:space="preserve"> files highlighted in Figure 2. Where these files contain the program code, the runtime framework required to run the program as well as any libraries need to be installed. </w:t>
+        <w:t xml:space="preserve">Figure 1, Shows the working SampleApp application being run inside the program files folder which was specified within the Product.wxs file. At this step there were some errors that occurred such as the program not being able to open. To fix this I had to include extra lines of code which specified additional components to include within the SampleApp folder such as the dll, config.json and dep.json files highlighted in Figure 2. Where these files contain the program code, the runtime framework required to run the program as well as any libraries need to be installed. </w:t>
       </w:r>
     </w:p>
     <w:p>
@@ -596,36 +492,12 @@
           <w:i/>
           <w:iCs/>
         </w:rPr>
-        <w:t xml:space="preserve">, </w:t>
-      </w:r>
-      <w:proofErr w:type="spellStart"/>
-      <w:r>
-        <w:rPr>
-          <w:i/>
-          <w:iCs/>
-        </w:rPr>
-        <w:t>SampleApp</w:t>
-      </w:r>
-      <w:proofErr w:type="spellEnd"/>
-      <w:r>
-        <w:rPr>
-          <w:i/>
-          <w:iCs/>
-        </w:rPr>
-        <w:t xml:space="preserve"> found in Apps</w:t>
-      </w:r>
-    </w:p>
-    <w:p>
-      <w:r>
-        <w:t>To finish of the first deployment task, I had to remove all applications detected in installed apps inside windows settings due to spamming the .</w:t>
-      </w:r>
-      <w:proofErr w:type="spellStart"/>
-      <w:r>
-        <w:t>msi</w:t>
-      </w:r>
-      <w:proofErr w:type="spellEnd"/>
-      <w:r>
-        <w:t xml:space="preserve"> installer when debugging how to run the </w:t>
+        <w:t>, SampleApp found in Apps</w:t>
+      </w:r>
+    </w:p>
+    <w:p>
+      <w:r>
+        <w:t xml:space="preserve">To finish of the first deployment task, I had to remove all applications detected in installed apps inside windows settings due to spamming the .msi installer when debugging how to run the </w:t>
       </w:r>
       <w:r>
         <w:lastRenderedPageBreak/>
@@ -799,47 +671,7 @@
     </w:p>
     <w:p>
       <w:r>
-        <w:t xml:space="preserve">After development of the application, I selected the build project option to create the CalculatorApp.exe and other dependencies required to use for WIX. After this I used the WIX extension to create the </w:t>
-      </w:r>
-      <w:proofErr w:type="spellStart"/>
-      <w:r>
-        <w:t>CalculatorAppSetup</w:t>
-      </w:r>
-      <w:proofErr w:type="spellEnd"/>
-      <w:r>
-        <w:t xml:space="preserve"> project which includes the .</w:t>
-      </w:r>
-      <w:proofErr w:type="spellStart"/>
-      <w:r>
-        <w:t>wx</w:t>
-      </w:r>
-      <w:proofErr w:type="spellEnd"/>
-      <w:r>
-        <w:t xml:space="preserve"> file where it determines what to download after running the </w:t>
-      </w:r>
-      <w:proofErr w:type="spellStart"/>
-      <w:r>
-        <w:t>CalculatorApp</w:t>
-      </w:r>
-      <w:proofErr w:type="spellEnd"/>
-      <w:r>
-        <w:t xml:space="preserve"> setup. In figure 5 The .</w:t>
-      </w:r>
-      <w:proofErr w:type="spellStart"/>
-      <w:r>
-        <w:t>wx</w:t>
-      </w:r>
-      <w:proofErr w:type="spellEnd"/>
-      <w:r>
-        <w:t xml:space="preserve"> I have copied the structure provided in the task 1 tutorial of the assignment where it defined the location of instalment in the Program files folder, furthermore I included extra lines of code defining the </w:t>
-      </w:r>
-      <w:proofErr w:type="spellStart"/>
-      <w:r>
-        <w:t>dll</w:t>
-      </w:r>
-      <w:proofErr w:type="spellEnd"/>
-      <w:r>
-        <w:t xml:space="preserve">, runtime, exe and deps files which are required to run the program as they include the code but framework the program runs on. </w:t>
+        <w:t xml:space="preserve">After development of the application, I selected the build project option to create the CalculatorApp.exe and other dependencies required to use for WIX. After this I used the WIX extension to create the CalculatorAppSetup project which includes the .wx file where it determines what to download after running the CalculatorApp setup. In figure 5 The .wx I have copied the structure provided in the task 1 tutorial of the assignment where it defined the location of instalment in the Program files folder, furthermore I included extra lines of code defining the dll, runtime, exe and deps files which are required to run the program as they include the code but framework the program runs on. </w:t>
       </w:r>
     </w:p>
     <w:p>
@@ -911,15 +743,7 @@
     <w:p>
       <w:r>
         <w:lastRenderedPageBreak/>
-        <w:t>Lastly, in figure 6 the image shows the output after creating a reference of the Calculator App then selecting the build option on the WIX project. This tool allows for the transformation of the .</w:t>
-      </w:r>
-      <w:proofErr w:type="spellStart"/>
-      <w:r>
-        <w:t>wx</w:t>
-      </w:r>
-      <w:proofErr w:type="spellEnd"/>
-      <w:r>
-        <w:t xml:space="preserve"> file into the MSI package which acts as a container for the Calculator application dependencies. </w:t>
+        <w:t xml:space="preserve">Lastly, in figure 6 the image shows the output after creating a reference of the Calculator App then selecting the build option on the WIX project. This tool allows for the transformation of the .wx file into the MSI package which acts as a container for the Calculator application dependencies. </w:t>
       </w:r>
     </w:p>
     <w:p>
@@ -1081,31 +905,7 @@
     </w:p>
     <w:p>
       <w:r>
-        <w:t xml:space="preserve">For the distinction task, it was required to implement multiple external DLLs so I have chosen the </w:t>
-      </w:r>
-      <w:proofErr w:type="spellStart"/>
-      <w:r>
-        <w:t>Mathnet</w:t>
-      </w:r>
-      <w:proofErr w:type="spellEnd"/>
-      <w:r>
-        <w:t xml:space="preserve"> and </w:t>
-      </w:r>
-      <w:proofErr w:type="spellStart"/>
-      <w:r>
-        <w:t>Newtonsoft</w:t>
-      </w:r>
-      <w:proofErr w:type="spellEnd"/>
-      <w:r>
-        <w:t xml:space="preserve"> library which helps in implementing complex mathematical operators as well as being able to store calculator history in </w:t>
-      </w:r>
-      <w:proofErr w:type="spellStart"/>
-      <w:r>
-        <w:t>json</w:t>
-      </w:r>
-      <w:proofErr w:type="spellEnd"/>
-      <w:r>
-        <w:t xml:space="preserve"> format. </w:t>
+        <w:t xml:space="preserve">For the distinction task, it was required to implement multiple external DLLs so I have chosen the Mathnet and Newtonsoft library which helps in implementing complex mathematical operators as well as being able to store calculator history in json format. </w:t>
       </w:r>
     </w:p>
     <w:p>
@@ -1201,38 +1001,185 @@
     </w:p>
     <w:p>
       <w:r>
-        <w:t xml:space="preserve">I have imported the mean method from the </w:t>
-      </w:r>
-      <w:proofErr w:type="spellStart"/>
-      <w:r>
-        <w:t>mathnet</w:t>
-      </w:r>
-      <w:proofErr w:type="spellEnd"/>
-      <w:r>
-        <w:t xml:space="preserve"> library to calculate the average from a given number, by taking the input of the user then storing the values inside an array after removing white spaces as well as separating each individual values. Then, applied the mean method on the array which iterates through each values and produces the average number in the array. </w:t>
+        <w:t xml:space="preserve">I have imported the mean method from the mathnet library to calculate the average from a given number, by taking the input of the user then storing the values inside an array after removing white spaces as well as separating each individual values. Then, applied the mean method on the array which iterates through each </w:t>
+      </w:r>
+      <w:r>
+        <w:t>value</w:t>
+      </w:r>
+      <w:r>
+        <w:t xml:space="preserve"> and produces the average number in the array. </w:t>
+      </w:r>
+    </w:p>
+    <w:p>
+      <w:pPr>
+        <w:pStyle w:val="Heading3"/>
+      </w:pPr>
+      <w:r>
+        <w:t xml:space="preserve">Json formatting </w:t>
+      </w:r>
+    </w:p>
+    <w:p>
+      <w:pPr>
+        <w:rPr>
+          <w:i/>
+          <w:iCs/>
+        </w:rPr>
+      </w:pPr>
+      <w:r>
+        <w:drawing>
+          <wp:inline distT="0" distB="0" distL="0" distR="0" wp14:anchorId="731A9D5A" wp14:editId="1D164F74">
+            <wp:extent cx="5660691" cy="2994660"/>
+            <wp:effectExtent l="0" t="0" r="0" b="0"/>
+            <wp:docPr id="1316001228" name="Picture 1"/>
+            <wp:cNvGraphicFramePr>
+              <a:graphicFrameLocks xmlns:a="http://schemas.openxmlformats.org/drawingml/2006/main" noChangeAspect="1"/>
+            </wp:cNvGraphicFramePr>
+            <a:graphic xmlns:a="http://schemas.openxmlformats.org/drawingml/2006/main">
+              <a:graphicData uri="http://schemas.openxmlformats.org/drawingml/2006/picture">
+                <pic:pic xmlns:pic="http://schemas.openxmlformats.org/drawingml/2006/picture">
+                  <pic:nvPicPr>
+                    <pic:cNvPr id="1316001228" name=""/>
+                    <pic:cNvPicPr/>
+                  </pic:nvPicPr>
+                  <pic:blipFill>
+                    <a:blip r:embed="rId14"/>
+                    <a:stretch>
+                      <a:fillRect/>
+                    </a:stretch>
+                  </pic:blipFill>
+                  <pic:spPr>
+                    <a:xfrm>
+                      <a:off x="0" y="0"/>
+                      <a:ext cx="5662513" cy="2995624"/>
+                    </a:xfrm>
+                    <a:prstGeom prst="rect">
+                      <a:avLst/>
+                    </a:prstGeom>
+                  </pic:spPr>
+                </pic:pic>
+              </a:graphicData>
+            </a:graphic>
+          </wp:inline>
+        </w:drawing>
+      </w:r>
+      <w:r>
+        <w:rPr>
+          <w:i/>
+          <w:iCs/>
+        </w:rPr>
+        <w:t xml:space="preserve">  </w:t>
+      </w:r>
+    </w:p>
+    <w:p>
+      <w:pPr>
+        <w:ind w:left="2880"/>
+      </w:pPr>
+      <w:r>
+        <w:rPr>
+          <w:i/>
+          <w:iCs/>
+        </w:rPr>
+        <w:lastRenderedPageBreak/>
+        <w:t>Figure 10, Json storage</w:t>
+      </w:r>
+    </w:p>
+    <w:p>
+      <w:r>
+        <w:t>Figure 10 highlights the usage of the JsonConvert class which was imported through NewSoft.json library which helps to format results into the json form. Additionally, the purpose of this library is to allow for the savings of calculation history so that whenever you have to do repeated calculations and you make a mistake you can return to any point you want.</w:t>
+      </w:r>
+      <w:r>
+        <w:t xml:space="preserve"> After this I had rebuilt the application then repeated the previous steps.</w:t>
+      </w:r>
+    </w:p>
+    <w:p>
+      <w:pPr>
+        <w:pStyle w:val="Heading3"/>
+      </w:pPr>
+      <w:r>
+        <w:t>Application with new Libraries</w:t>
+      </w:r>
+    </w:p>
+    <w:p>
+      <w:r>
+        <w:drawing>
+          <wp:inline distT="0" distB="0" distL="0" distR="0" wp14:anchorId="7ECE7CBD" wp14:editId="09E63966">
+            <wp:extent cx="5731510" cy="3331845"/>
+            <wp:effectExtent l="0" t="0" r="2540" b="1905"/>
+            <wp:docPr id="2138779496" name="Picture 1"/>
+            <wp:cNvGraphicFramePr>
+              <a:graphicFrameLocks xmlns:a="http://schemas.openxmlformats.org/drawingml/2006/main" noChangeAspect="1"/>
+            </wp:cNvGraphicFramePr>
+            <a:graphic xmlns:a="http://schemas.openxmlformats.org/drawingml/2006/main">
+              <a:graphicData uri="http://schemas.openxmlformats.org/drawingml/2006/picture">
+                <pic:pic xmlns:pic="http://schemas.openxmlformats.org/drawingml/2006/picture">
+                  <pic:nvPicPr>
+                    <pic:cNvPr id="2138779496" name=""/>
+                    <pic:cNvPicPr/>
+                  </pic:nvPicPr>
+                  <pic:blipFill>
+                    <a:blip r:embed="rId15"/>
+                    <a:stretch>
+                      <a:fillRect/>
+                    </a:stretch>
+                  </pic:blipFill>
+                  <pic:spPr>
+                    <a:xfrm>
+                      <a:off x="0" y="0"/>
+                      <a:ext cx="5731510" cy="3331845"/>
+                    </a:xfrm>
+                    <a:prstGeom prst="rect">
+                      <a:avLst/>
+                    </a:prstGeom>
+                  </pic:spPr>
+                </pic:pic>
+              </a:graphicData>
+            </a:graphic>
+          </wp:inline>
+        </w:drawing>
+      </w:r>
+    </w:p>
+    <w:p>
+      <w:pPr>
+        <w:rPr>
+          <w:i/>
+          <w:iCs/>
+        </w:rPr>
+      </w:pPr>
+      <w:r>
+        <w:tab/>
+      </w:r>
+      <w:r>
+        <w:tab/>
+      </w:r>
+      <w:r>
+        <w:tab/>
+      </w:r>
+      <w:r>
+        <w:tab/>
+      </w:r>
+      <w:r>
+        <w:rPr>
+          <w:i/>
+          <w:iCs/>
+        </w:rPr>
+        <w:t xml:space="preserve">Figure 11, Mean and Json </w:t>
       </w:r>
     </w:p>
     <w:p/>
+    <w:p>
+      <w:pPr>
+        <w:pStyle w:val="Heading1"/>
+      </w:pPr>
+      <w:r>
+        <w:t xml:space="preserve">External Code &amp; Script Repository </w:t>
+      </w:r>
+    </w:p>
     <w:p/>
     <w:p>
-      <w:pPr>
-        <w:pStyle w:val="Heading1"/>
-      </w:pPr>
-      <w:r>
-        <w:t xml:space="preserve">External Code &amp; Script Repository </w:t>
-      </w:r>
-    </w:p>
-    <w:p/>
-    <w:p>
-      <w:proofErr w:type="spellStart"/>
-      <w:r>
-        <w:t>Github</w:t>
-      </w:r>
-      <w:proofErr w:type="spellEnd"/>
-      <w:r>
-        <w:t xml:space="preserve"> repository: </w:t>
-      </w:r>
-      <w:hyperlink r:id="rId14" w:history="1">
+      <w:r>
+        <w:t xml:space="preserve">Github repository: </w:t>
+      </w:r>
+      <w:hyperlink r:id="rId16" w:history="1">
         <w:r>
           <w:rPr>
             <w:rStyle w:val="Hyperlink"/>

</xml_diff>